<commit_message>
Redraw thesis figures and cover lines
</commit_message>
<xml_diff>
--- a/docs/interest-team-graduation-thesis.docx
+++ b/docs/interest-team-graduation-thesis.docx
@@ -267,7 +267,9 @@
           <w:tcPr>
             <w:tcW w:w="6380" w:type="dxa"/>
             <w:gridSpan w:val="2"/>
-            <w:tcBorders/>
+            <w:tcBorders>
+              <w:bottom w:val="single" w:sz="12" w:space="0" w:color="000000"/>
+            </w:tcBorders>
             <w:vAlign w:val="center"/>
           </w:tcPr>
           <w:p>
@@ -288,7 +290,7 @@
                 <w:b/>
                 <w:sz w:val="32"/>
                 <w:szCs w:val="32"/>
-                <w:u w:val="single"/>
+                <w:u w:val="none"/>
               </w:rPr>
               <w:t>请填写</w:t>
             </w:r>
@@ -298,7 +300,7 @@
                 <w:b/>
                 <w:sz w:val="32"/>
                 <w:szCs w:val="32"/>
-                <w:u w:val="single"/>
+                <w:u w:val="none"/>
               </w:rPr>
             </w:r>
             <w:r>
@@ -307,7 +309,7 @@
                 <w:b/>
                 <w:sz w:val="32"/>
                 <w:szCs w:val="32"/>
-                <w:u w:val="single"/>
+                <w:u w:val="none"/>
               </w:rPr>
             </w:r>
           </w:p>
@@ -349,7 +351,9 @@
           <w:tcPr>
             <w:tcW w:w="6380" w:type="dxa"/>
             <w:gridSpan w:val="2"/>
-            <w:tcBorders/>
+            <w:tcBorders>
+              <w:bottom w:val="single" w:sz="12" w:space="0" w:color="000000"/>
+            </w:tcBorders>
             <w:vAlign w:val="center"/>
           </w:tcPr>
           <w:p>
@@ -370,7 +374,7 @@
                 <w:b/>
                 <w:sz w:val="32"/>
                 <w:szCs w:val="32"/>
-                <w:u w:val="single"/>
+                <w:u w:val="none"/>
               </w:rPr>
               <w:t xml:space="preserve">       </w:t>
             </w:r>
@@ -380,7 +384,7 @@
                 <w:b/>
                 <w:sz w:val="32"/>
                 <w:szCs w:val="32"/>
-                <w:u w:val="single"/>
+                <w:u w:val="none"/>
               </w:rPr>
               <w:t xml:space="preserve"> </w:t>
             </w:r>
@@ -390,7 +394,7 @@
                 <w:b/>
                 <w:sz w:val="32"/>
                 <w:szCs w:val="32"/>
-                <w:u w:val="single"/>
+                <w:u w:val="none"/>
               </w:rPr>
               <w:t>人工智能</w:t>
             </w:r>
@@ -400,7 +404,7 @@
                 <w:b/>
                 <w:sz w:val="32"/>
                 <w:szCs w:val="32"/>
-                <w:u w:val="single"/>
+                <w:u w:val="none"/>
               </w:rPr>
               <w:t>学院</w:t>
             </w:r>
@@ -410,7 +414,7 @@
                 <w:b/>
                 <w:sz w:val="32"/>
                 <w:szCs w:val="32"/>
-                <w:u w:val="single"/>
+                <w:u w:val="none"/>
               </w:rPr>
               <w:t>、软件学院</w:t>
             </w:r>
@@ -420,7 +424,7 @@
                 <w:b/>
                 <w:sz w:val="32"/>
                 <w:szCs w:val="32"/>
-                <w:u w:val="single"/>
+                <w:u w:val="none"/>
               </w:rPr>
               <w:t xml:space="preserve">                        </w:t>
             </w:r>
@@ -463,7 +467,9 @@
           <w:tcPr>
             <w:tcW w:w="6380" w:type="dxa"/>
             <w:gridSpan w:val="2"/>
-            <w:tcBorders/>
+            <w:tcBorders>
+              <w:bottom w:val="single" w:sz="12" w:space="0" w:color="000000"/>
+            </w:tcBorders>
             <w:vAlign w:val="center"/>
           </w:tcPr>
           <w:p>
@@ -484,7 +490,7 @@
                 <w:b/>
                 <w:sz w:val="32"/>
                 <w:szCs w:val="32"/>
-                <w:u w:val="single"/>
+                <w:u w:val="none"/>
               </w:rPr>
               <w:t xml:space="preserve">        </w:t>
             </w:r>
@@ -494,7 +500,7 @@
                 <w:b/>
                 <w:sz w:val="32"/>
                 <w:szCs w:val="32"/>
-                <w:u w:val="single"/>
+                <w:u w:val="none"/>
               </w:rPr>
               <w:t xml:space="preserve">      </w:t>
             </w:r>
@@ -504,7 +510,7 @@
                 <w:b/>
                 <w:sz w:val="32"/>
                 <w:szCs w:val="32"/>
-                <w:u w:val="single"/>
+                <w:u w:val="none"/>
               </w:rPr>
               <w:t>软件</w:t>
             </w:r>
@@ -514,7 +520,7 @@
                 <w:b/>
                 <w:sz w:val="32"/>
                 <w:szCs w:val="32"/>
-                <w:u w:val="single"/>
+                <w:u w:val="none"/>
               </w:rPr>
               <w:t xml:space="preserve">工程                         </w:t>
             </w:r>
@@ -557,7 +563,9 @@
           <w:tcPr>
             <w:tcW w:w="6380" w:type="dxa"/>
             <w:gridSpan w:val="2"/>
-            <w:tcBorders/>
+            <w:tcBorders>
+              <w:bottom w:val="single" w:sz="12" w:space="0" w:color="000000"/>
+            </w:tcBorders>
             <w:vAlign w:val="center"/>
           </w:tcPr>
           <w:p>
@@ -578,7 +586,7 @@
                 <w:b/>
                 <w:sz w:val="32"/>
                 <w:szCs w:val="32"/>
-                <w:u w:val="single"/>
+                <w:u w:val="none"/>
               </w:rPr>
               <w:t xml:space="preserve">         </w:t>
             </w:r>
@@ -588,7 +596,7 @@
                 <w:b/>
                 <w:sz w:val="32"/>
                 <w:szCs w:val="32"/>
-                <w:u w:val="single"/>
+                <w:u w:val="none"/>
               </w:rPr>
               <w:t xml:space="preserve">   </w:t>
             </w:r>
@@ -598,7 +606,7 @@
                 <w:b/>
                 <w:sz w:val="32"/>
                 <w:szCs w:val="32"/>
-                <w:u w:val="single"/>
+                <w:u w:val="none"/>
               </w:rPr>
               <w:t>信</w:t>
             </w:r>
@@ -608,7 +616,7 @@
                 <w:b/>
                 <w:sz w:val="32"/>
                 <w:szCs w:val="32"/>
-                <w:u w:val="single"/>
+                <w:u w:val="none"/>
               </w:rPr>
               <w:t>2</w:t>
             </w:r>
@@ -618,7 +626,7 @@
                 <w:b/>
                 <w:sz w:val="32"/>
                 <w:szCs w:val="32"/>
-                <w:u w:val="single"/>
+                <w:u w:val="none"/>
               </w:rPr>
               <w:t>2</w:t>
             </w:r>
@@ -628,7 +636,7 @@
                 <w:b/>
                 <w:sz w:val="32"/>
                 <w:szCs w:val="32"/>
-                <w:u w:val="single"/>
+                <w:u w:val="none"/>
               </w:rPr>
               <w:t>（</w:t>
             </w:r>
@@ -638,7 +646,7 @@
                 <w:b/>
                 <w:sz w:val="32"/>
                 <w:szCs w:val="32"/>
-                <w:u w:val="single"/>
+                <w:u w:val="none"/>
               </w:rPr>
               <w:t>*</w:t>
             </w:r>
@@ -648,7 +656,7 @@
                 <w:b/>
                 <w:sz w:val="32"/>
                 <w:szCs w:val="32"/>
-                <w:u w:val="single"/>
+                <w:u w:val="none"/>
               </w:rPr>
               <w:t>）</w:t>
             </w:r>
@@ -658,7 +666,7 @@
                 <w:b/>
                 <w:sz w:val="32"/>
                 <w:szCs w:val="32"/>
-                <w:u w:val="single"/>
+                <w:u w:val="none"/>
               </w:rPr>
               <w:t>软件</w:t>
             </w:r>
@@ -668,7 +676,7 @@
                 <w:b/>
                 <w:sz w:val="32"/>
                 <w:szCs w:val="32"/>
-                <w:u w:val="single"/>
+                <w:u w:val="none"/>
               </w:rPr>
               <w:t xml:space="preserve">                        </w:t>
             </w:r>
@@ -711,7 +719,9 @@
           <w:tcPr>
             <w:tcW w:w="6380" w:type="dxa"/>
             <w:gridSpan w:val="2"/>
-            <w:tcBorders/>
+            <w:tcBorders>
+              <w:bottom w:val="single" w:sz="12" w:space="0" w:color="000000"/>
+            </w:tcBorders>
             <w:vAlign w:val="center"/>
           </w:tcPr>
           <w:p>
@@ -732,7 +742,7 @@
                 <w:b/>
                 <w:sz w:val="32"/>
                 <w:szCs w:val="32"/>
-                <w:u w:val="single"/>
+                <w:u w:val="none"/>
               </w:rPr>
               <w:t xml:space="preserve">           </w:t>
             </w:r>
@@ -742,7 +752,7 @@
                 <w:b/>
                 <w:sz w:val="32"/>
                 <w:szCs w:val="32"/>
-                <w:u w:val="single"/>
+                <w:u w:val="none"/>
               </w:rPr>
               <w:t xml:space="preserve">   </w:t>
             </w:r>
@@ -752,7 +762,7 @@
                 <w:b/>
                 <w:sz w:val="32"/>
                 <w:szCs w:val="32"/>
-                <w:u w:val="single"/>
+                <w:u w:val="none"/>
               </w:rPr>
               <w:t>**********</w:t>
             </w:r>
@@ -762,7 +772,7 @@
                 <w:b/>
                 <w:sz w:val="32"/>
                 <w:szCs w:val="32"/>
-                <w:u w:val="single"/>
+                <w:u w:val="none"/>
               </w:rPr>
               <w:t xml:space="preserve">                         </w:t>
             </w:r>
@@ -806,7 +816,9 @@
         <w:tc>
           <w:tcPr>
             <w:tcW w:w="5530" w:type="dxa"/>
-            <w:tcBorders/>
+            <w:tcBorders>
+              <w:bottom w:val="single" w:sz="12" w:space="0" w:color="000000"/>
+            </w:tcBorders>
             <w:vAlign w:val="center"/>
           </w:tcPr>
           <w:p>
@@ -826,7 +838,7 @@
                 <w:b/>
                 <w:sz w:val="32"/>
                 <w:szCs w:val="32"/>
-                <w:u w:val="single"/>
+                <w:u w:val="none"/>
               </w:rPr>
               <w:t xml:space="preserve">    </w:t>
             </w:r>
@@ -836,7 +848,7 @@
                 <w:b/>
                 <w:sz w:val="32"/>
                 <w:szCs w:val="32"/>
-                <w:u w:val="single"/>
+                <w:u w:val="none"/>
               </w:rPr>
               <w:t>***</w:t>
             </w:r>
@@ -846,7 +858,7 @@
                 <w:b/>
                 <w:sz w:val="32"/>
                 <w:szCs w:val="32"/>
-                <w:u w:val="single"/>
+                <w:u w:val="none"/>
               </w:rPr>
               <w:t xml:space="preserve">   </w:t>
             </w:r>
@@ -856,7 +868,7 @@
                 <w:b/>
                 <w:sz w:val="32"/>
                 <w:szCs w:val="32"/>
-                <w:u w:val="single"/>
+                <w:u w:val="none"/>
               </w:rPr>
               <w:t xml:space="preserve"> </w:t>
             </w:r>
@@ -866,6 +878,7 @@
                 <w:b/>
                 <w:sz w:val="32"/>
                 <w:szCs w:val="32"/>
+                <w:u w:val="none"/>
               </w:rPr>
               <w:t xml:space="preserve"> </w:t>
               <w:tab/>
@@ -876,6 +889,7 @@
                 <w:b/>
                 <w:sz w:val="32"/>
                 <w:szCs w:val="32"/>
+                <w:u w:val="none"/>
               </w:rPr>
               <w:t>职称</w:t>
             </w:r>
@@ -885,7 +899,7 @@
                 <w:b/>
                 <w:sz w:val="32"/>
                 <w:szCs w:val="32"/>
-                <w:u w:val="single"/>
+                <w:u w:val="none"/>
               </w:rPr>
               <w:t xml:space="preserve">     </w:t>
             </w:r>
@@ -895,7 +909,7 @@
                 <w:b/>
                 <w:sz w:val="32"/>
                 <w:szCs w:val="32"/>
-                <w:u w:val="single"/>
+                <w:u w:val="none"/>
               </w:rPr>
               <w:t>***</w:t>
             </w:r>
@@ -905,7 +919,7 @@
                 <w:b/>
                 <w:sz w:val="32"/>
                 <w:szCs w:val="32"/>
-                <w:u w:val="single"/>
+                <w:u w:val="none"/>
               </w:rPr>
               <w:t xml:space="preserve">   </w:t>
             </w:r>
@@ -915,7 +929,7 @@
                 <w:b/>
                 <w:sz w:val="32"/>
                 <w:szCs w:val="32"/>
-                <w:u w:val="single"/>
+                <w:u w:val="none"/>
               </w:rPr>
               <w:t xml:space="preserve"> </w:t>
             </w:r>
@@ -925,7 +939,7 @@
                 <w:b/>
                 <w:sz w:val="32"/>
                 <w:szCs w:val="32"/>
-                <w:u w:val="single"/>
+                <w:u w:val="none"/>
               </w:rPr>
               <w:t xml:space="preserve"> </w:t>
             </w:r>
@@ -935,7 +949,7 @@
                 <w:b/>
                 <w:sz w:val="32"/>
                 <w:szCs w:val="32"/>
-                <w:u w:val="single"/>
+                <w:u w:val="none"/>
               </w:rPr>
               <w:t xml:space="preserve"> </w:t>
             </w:r>
@@ -945,7 +959,7 @@
                 <w:b/>
                 <w:sz w:val="32"/>
                 <w:szCs w:val="32"/>
-                <w:u w:val="single"/>
+                <w:u w:val="none"/>
               </w:rPr>
               <w:t xml:space="preserve">         </w:t>
             </w:r>
@@ -955,6 +969,7 @@
                 <w:b/>
                 <w:sz w:val="32"/>
                 <w:szCs w:val="32"/>
+                <w:u w:val="none"/>
               </w:rPr>
               <w:t xml:space="preserve"> </w:t>
             </w:r>
@@ -999,7 +1014,9 @@
         <w:tc>
           <w:tcPr>
             <w:tcW w:w="5530" w:type="dxa"/>
-            <w:tcBorders/>
+            <w:tcBorders>
+              <w:bottom w:val="single" w:sz="12" w:space="0" w:color="000000"/>
+            </w:tcBorders>
             <w:vAlign w:val="center"/>
           </w:tcPr>
           <w:p>
@@ -1020,7 +1037,7 @@
                 <w:b/>
                 <w:sz w:val="32"/>
                 <w:szCs w:val="32"/>
-                <w:u w:val="single"/>
+                <w:u w:val="none"/>
               </w:rPr>
               <w:t xml:space="preserve">    </w:t>
             </w:r>
@@ -1030,7 +1047,7 @@
                 <w:b/>
                 <w:sz w:val="32"/>
                 <w:szCs w:val="32"/>
-                <w:u w:val="single"/>
+                <w:u w:val="none"/>
               </w:rPr>
               <w:t>****</w:t>
             </w:r>
@@ -1040,7 +1057,7 @@
                 <w:b/>
                 <w:sz w:val="32"/>
                 <w:szCs w:val="32"/>
-                <w:u w:val="single"/>
+                <w:u w:val="none"/>
               </w:rPr>
               <w:t xml:space="preserve">  </w:t>
             </w:r>
@@ -1050,7 +1067,7 @@
                 <w:b/>
                 <w:sz w:val="32"/>
                 <w:szCs w:val="32"/>
-                <w:u w:val="single"/>
+                <w:u w:val="none"/>
               </w:rPr>
               <w:t xml:space="preserve"> </w:t>
             </w:r>
@@ -1060,7 +1077,7 @@
                 <w:b/>
                 <w:sz w:val="32"/>
                 <w:szCs w:val="32"/>
-                <w:u w:val="single"/>
+                <w:u w:val="none"/>
               </w:rPr>
               <w:t xml:space="preserve"> </w:t>
             </w:r>
@@ -1070,6 +1087,7 @@
                 <w:b/>
                 <w:sz w:val="32"/>
                 <w:szCs w:val="32"/>
+                <w:u w:val="none"/>
               </w:rPr>
               <w:tab/>
             </w:r>
@@ -1079,6 +1097,7 @@
                 <w:b/>
                 <w:sz w:val="32"/>
                 <w:szCs w:val="32"/>
+                <w:u w:val="none"/>
               </w:rPr>
               <w:t>职称</w:t>
             </w:r>
@@ -1088,7 +1107,7 @@
                 <w:b/>
                 <w:sz w:val="32"/>
                 <w:szCs w:val="32"/>
-                <w:u w:val="single"/>
+                <w:u w:val="none"/>
               </w:rPr>
               <w:t xml:space="preserve">  </w:t>
             </w:r>
@@ -1098,7 +1117,7 @@
                 <w:b/>
                 <w:sz w:val="32"/>
                 <w:szCs w:val="32"/>
-                <w:u w:val="single"/>
+                <w:u w:val="none"/>
               </w:rPr>
               <w:t xml:space="preserve">   </w:t>
             </w:r>
@@ -1108,7 +1127,7 @@
                 <w:b/>
                 <w:sz w:val="32"/>
                 <w:szCs w:val="32"/>
-                <w:u w:val="single"/>
+                <w:u w:val="none"/>
               </w:rPr>
               <w:t>***</w:t>
             </w:r>
@@ -1118,7 +1137,7 @@
                 <w:b/>
                 <w:sz w:val="32"/>
                 <w:szCs w:val="32"/>
-                <w:u w:val="single"/>
+                <w:u w:val="none"/>
               </w:rPr>
               <w:t xml:space="preserve">                </w:t>
             </w:r>
@@ -1128,6 +1147,7 @@
                 <w:b/>
                 <w:sz w:val="32"/>
                 <w:szCs w:val="32"/>
+                <w:u w:val="none"/>
               </w:rPr>
               <w:t xml:space="preserve"> </w:t>
             </w:r>
@@ -1142,7 +1162,9 @@
           <w:tcPr>
             <w:tcW w:w="7798" w:type="dxa"/>
             <w:gridSpan w:val="3"/>
-            <w:tcBorders/>
+            <w:tcBorders>
+              <w:bottom w:val="single" w:sz="12" w:space="0" w:color="000000"/>
+            </w:tcBorders>
             <w:vAlign w:val="center"/>
           </w:tcPr>
           <w:p>
@@ -1171,6 +1193,7 @@
                 <w:bCs/>
                 <w:sz w:val="32"/>
                 <w:szCs w:val="32"/>
+                <w:u w:val="none"/>
               </w:rPr>
               <w:t xml:space="preserve">校外指导教师任职单位 </w:t>
             </w:r>
@@ -1181,7 +1204,7 @@
                 <w:bCs/>
                 <w:sz w:val="28"/>
                 <w:szCs w:val="28"/>
-                <w:u w:val="single" w:color="000000"/>
+                <w:u w:val="none"/>
               </w:rPr>
               <w:t>中国移动通信集团江苏有限公司</w:t>
             </w:r>
@@ -1192,7 +1215,7 @@
                 <w:bCs/>
                 <w:sz w:val="28"/>
                 <w:szCs w:val="28"/>
-                <w:u w:val="single"/>
+                <w:u w:val="none"/>
               </w:rPr>
               <w:t xml:space="preserve">   </w:t>
             </w:r>
@@ -2632,7 +2655,7 @@
                 <w:rStyle w:val="IndexLink"/>
               </w:rPr>
               <w:tab/>
-              <w:t>6</w:t>
+              <w:t>5</w:t>
             </w:r>
           </w:hyperlink>
         </w:p>
@@ -2664,7 +2687,7 @@
                 <w:rStyle w:val="IndexLink"/>
               </w:rPr>
               <w:tab/>
-              <w:t>6</w:t>
+              <w:t>5</w:t>
             </w:r>
           </w:hyperlink>
         </w:p>
@@ -2762,7 +2785,7 @@
                 <w:rStyle w:val="IndexLink"/>
               </w:rPr>
               <w:tab/>
-              <w:t>10</w:t>
+              <w:t>9</w:t>
             </w:r>
           </w:hyperlink>
         </w:p>
@@ -2794,7 +2817,7 @@
                 <w:rStyle w:val="IndexLink"/>
               </w:rPr>
               <w:tab/>
-              <w:t>10</w:t>
+              <w:t>9</w:t>
             </w:r>
           </w:hyperlink>
         </w:p>
@@ -2826,7 +2849,7 @@
                 <w:rStyle w:val="IndexLink"/>
               </w:rPr>
               <w:tab/>
-              <w:t>11</w:t>
+              <w:t>10</w:t>
             </w:r>
           </w:hyperlink>
         </w:p>
@@ -2890,7 +2913,7 @@
                 <w:rStyle w:val="IndexLink"/>
               </w:rPr>
               <w:tab/>
-              <w:t>12</w:t>
+              <w:t>11</w:t>
             </w:r>
           </w:hyperlink>
         </w:p>
@@ -2922,7 +2945,7 @@
                 <w:rStyle w:val="IndexLink"/>
               </w:rPr>
               <w:tab/>
-              <w:t>12</w:t>
+              <w:t>11</w:t>
             </w:r>
           </w:hyperlink>
         </w:p>
@@ -2986,7 +3009,7 @@
                 <w:rStyle w:val="IndexLink"/>
               </w:rPr>
               <w:tab/>
-              <w:t>13</w:t>
+              <w:t>12</w:t>
             </w:r>
           </w:hyperlink>
         </w:p>
@@ -3018,7 +3041,7 @@
                 <w:rStyle w:val="IndexLink"/>
               </w:rPr>
               <w:tab/>
-              <w:t>13</w:t>
+              <w:t>12</w:t>
             </w:r>
           </w:hyperlink>
         </w:p>
@@ -3050,7 +3073,7 @@
                 <w:rStyle w:val="IndexLink"/>
               </w:rPr>
               <w:tab/>
-              <w:t>14</w:t>
+              <w:t>13</w:t>
             </w:r>
           </w:hyperlink>
         </w:p>
@@ -3082,7 +3105,7 @@
                 <w:rStyle w:val="IndexLink"/>
               </w:rPr>
               <w:tab/>
-              <w:t>14</w:t>
+              <w:t>13</w:t>
             </w:r>
           </w:hyperlink>
         </w:p>
@@ -3150,7 +3173,7 @@
                 <w:rStyle w:val="IndexLink"/>
               </w:rPr>
               <w:tab/>
-              <w:t>15</w:t>
+              <w:t>14</w:t>
             </w:r>
           </w:hyperlink>
         </w:p>
@@ -3182,7 +3205,7 @@
                 <w:rStyle w:val="IndexLink"/>
               </w:rPr>
               <w:tab/>
-              <w:t>15</w:t>
+              <w:t>14</w:t>
             </w:r>
           </w:hyperlink>
         </w:p>
@@ -3214,7 +3237,7 @@
                 <w:rStyle w:val="IndexLink"/>
               </w:rPr>
               <w:tab/>
-              <w:t>16</w:t>
+              <w:t>15</w:t>
             </w:r>
           </w:hyperlink>
         </w:p>
@@ -3246,7 +3269,7 @@
                 <w:rStyle w:val="IndexLink"/>
               </w:rPr>
               <w:tab/>
-              <w:t>22</w:t>
+              <w:t>21</w:t>
             </w:r>
           </w:hyperlink>
         </w:p>
@@ -3278,7 +3301,7 @@
                 <w:rStyle w:val="IndexLink"/>
               </w:rPr>
               <w:tab/>
-              <w:t>22</w:t>
+              <w:t>21</w:t>
             </w:r>
           </w:hyperlink>
         </w:p>
@@ -3310,7 +3333,7 @@
                 <w:rStyle w:val="IndexLink"/>
               </w:rPr>
               <w:tab/>
-              <w:t>22</w:t>
+              <w:t>21</w:t>
             </w:r>
           </w:hyperlink>
         </w:p>
@@ -3374,7 +3397,7 @@
                 <w:rStyle w:val="IndexLink"/>
               </w:rPr>
               <w:tab/>
-              <w:t>25</w:t>
+              <w:t>24</w:t>
             </w:r>
           </w:hyperlink>
         </w:p>
@@ -3470,7 +3493,7 @@
                 <w:rStyle w:val="IndexLink"/>
               </w:rPr>
               <w:tab/>
-              <w:t>26</w:t>
+              <w:t>25</w:t>
             </w:r>
           </w:hyperlink>
         </w:p>
@@ -3758,7 +3781,7 @@
                 <w:rStyle w:val="IndexLink"/>
               </w:rPr>
               <w:tab/>
-              <w:t>32</w:t>
+              <w:t>33</w:t>
             </w:r>
           </w:hyperlink>
         </w:p>
@@ -3982,7 +4005,7 @@
                 <w:rStyle w:val="IndexLink"/>
               </w:rPr>
               <w:tab/>
-              <w:t>37</w:t>
+              <w:t>38</w:t>
             </w:r>
           </w:hyperlink>
         </w:p>
@@ -4014,7 +4037,7 @@
                 <w:rStyle w:val="IndexLink"/>
               </w:rPr>
               <w:tab/>
-              <w:t>37</w:t>
+              <w:t>38</w:t>
             </w:r>
           </w:hyperlink>
         </w:p>
@@ -4050,7 +4073,7 @@
                 <w:rStyle w:val="IndexLink"/>
               </w:rPr>
               <w:tab/>
-              <w:t>37</w:t>
+              <w:t>38</w:t>
             </w:r>
           </w:hyperlink>
         </w:p>
@@ -4082,7 +4105,7 @@
                 <w:rStyle w:val="IndexLink"/>
               </w:rPr>
               <w:tab/>
-              <w:t>38</w:t>
+              <w:t>39</w:t>
             </w:r>
           </w:hyperlink>
         </w:p>
@@ -4127,7 +4150,7 @@
                 <w:rStyle w:val="IndexLink"/>
               </w:rPr>
               <w:tab/>
-              <w:t>38</w:t>
+              <w:t>39</w:t>
             </w:r>
           </w:hyperlink>
         </w:p>
@@ -4159,7 +4182,7 @@
                 <w:rStyle w:val="IndexLink"/>
               </w:rPr>
               <w:tab/>
-              <w:t>38</w:t>
+              <w:t>39</w:t>
             </w:r>
           </w:hyperlink>
         </w:p>
@@ -4191,7 +4214,7 @@
                 <w:rStyle w:val="IndexLink"/>
               </w:rPr>
               <w:tab/>
-              <w:t>40</w:t>
+              <w:t>41</w:t>
             </w:r>
           </w:hyperlink>
         </w:p>
@@ -4223,7 +4246,7 @@
                 <w:rStyle w:val="IndexLink"/>
               </w:rPr>
               <w:tab/>
-              <w:t>41</w:t>
+              <w:t>42</w:t>
             </w:r>
           </w:hyperlink>
         </w:p>
@@ -4255,7 +4278,7 @@
                 <w:rStyle w:val="IndexLink"/>
               </w:rPr>
               <w:tab/>
-              <w:t>41</w:t>
+              <w:t>42</w:t>
             </w:r>
           </w:hyperlink>
         </w:p>
@@ -4287,7 +4310,7 @@
                 <w:rStyle w:val="IndexLink"/>
               </w:rPr>
               <w:tab/>
-              <w:t>41</w:t>
+              <w:t>43</w:t>
             </w:r>
           </w:hyperlink>
         </w:p>
@@ -4319,7 +4342,7 @@
                 <w:rStyle w:val="IndexLink"/>
               </w:rPr>
               <w:tab/>
-              <w:t>42</w:t>
+              <w:t>43</w:t>
             </w:r>
           </w:hyperlink>
         </w:p>
@@ -4361,7 +4384,7 @@
                 <w:rStyle w:val="IndexLink"/>
               </w:rPr>
               <w:tab/>
-              <w:t>44</w:t>
+              <w:t>45</w:t>
             </w:r>
           </w:hyperlink>
         </w:p>
@@ -4387,7 +4410,7 @@
                 <w:rStyle w:val="IndexLink"/>
               </w:rPr>
               <w:tab/>
-              <w:t>45</w:t>
+              <w:t>46</w:t>
             </w:r>
           </w:hyperlink>
         </w:p>
@@ -4425,7 +4448,7 @@
                 <w:rStyle w:val="IndexLink"/>
               </w:rPr>
               <w:tab/>
-              <w:t>45</w:t>
+              <w:t>47</w:t>
             </w:r>
           </w:hyperlink>
           <w:r>
@@ -6231,7 +6254,7 @@
         </w:rPr>
         <w:drawing>
           <wp:inline distT="0" distB="0" distL="0" distR="0">
-            <wp:extent cx="3012440" cy="2741295"/>
+            <wp:extent cx="5303520" cy="2983230"/>
             <wp:effectExtent l="0" t="0" r="0" b="0"/>
             <wp:docPr id="1" name="图片 141"/>
             <wp:cNvGraphicFramePr>
@@ -6256,7 +6279,7 @@
                   <pic:spPr bwMode="auto">
                     <a:xfrm>
                       <a:off x="0" y="0"/>
-                      <a:ext cx="3012440" cy="2741295"/>
+                      <a:ext cx="5303520" cy="2983230"/>
                     </a:xfrm>
                     <a:prstGeom prst="rect">
                       <a:avLst/>
@@ -6404,7 +6427,7 @@
         </w:rPr>
         <w:drawing>
           <wp:inline distT="0" distB="0" distL="0" distR="0">
-            <wp:extent cx="3688715" cy="4441825"/>
+            <wp:extent cx="5303520" cy="2983230"/>
             <wp:effectExtent l="0" t="0" r="0" b="0"/>
             <wp:docPr id="2" name="图片 147"/>
             <wp:cNvGraphicFramePr>
@@ -6429,7 +6452,7 @@
                   <pic:spPr bwMode="auto">
                     <a:xfrm>
                       <a:off x="0" y="0"/>
-                      <a:ext cx="3688715" cy="4441825"/>
+                      <a:ext cx="5303520" cy="2983230"/>
                     </a:xfrm>
                     <a:prstGeom prst="rect">
                       <a:avLst/>
@@ -6589,7 +6612,7 @@
         </w:rPr>
         <w:drawing>
           <wp:inline distT="0" distB="0" distL="0" distR="0">
-            <wp:extent cx="3589655" cy="3377565"/>
+            <wp:extent cx="5303520" cy="2983230"/>
             <wp:effectExtent l="0" t="0" r="0" b="0"/>
             <wp:docPr id="3" name="图片 192"/>
             <wp:cNvGraphicFramePr>
@@ -6614,7 +6637,7 @@
                   <pic:spPr bwMode="auto">
                     <a:xfrm>
                       <a:off x="0" y="0"/>
-                      <a:ext cx="3589655" cy="3377565"/>
+                      <a:ext cx="5303520" cy="2983230"/>
                     </a:xfrm>
                     <a:prstGeom prst="rect">
                       <a:avLst/>
@@ -6762,7 +6785,7 @@
         </w:rPr>
         <w:drawing>
           <wp:inline distT="0" distB="0" distL="0" distR="0">
-            <wp:extent cx="3335655" cy="3312795"/>
+            <wp:extent cx="5303520" cy="2983230"/>
             <wp:effectExtent l="0" t="0" r="0" b="0"/>
             <wp:docPr id="4" name="图片 193"/>
             <wp:cNvGraphicFramePr>
@@ -6787,7 +6810,7 @@
                   <pic:spPr bwMode="auto">
                     <a:xfrm>
                       <a:off x="0" y="0"/>
-                      <a:ext cx="3335655" cy="3312795"/>
+                      <a:ext cx="5303520" cy="2983230"/>
                     </a:xfrm>
                     <a:prstGeom prst="rect">
                       <a:avLst/>
@@ -6972,7 +6995,7 @@
         </w:rPr>
         <w:drawing>
           <wp:inline distT="0" distB="0" distL="0" distR="0">
-            <wp:extent cx="2632710" cy="4178300"/>
+            <wp:extent cx="5303520" cy="2983230"/>
             <wp:effectExtent l="0" t="0" r="0" b="0"/>
             <wp:docPr id="5" name="图片 36"/>
             <wp:cNvGraphicFramePr>
@@ -6997,7 +7020,7 @@
                   <pic:spPr bwMode="auto">
                     <a:xfrm>
                       <a:off x="0" y="0"/>
-                      <a:ext cx="2632710" cy="4178300"/>
+                      <a:ext cx="5303520" cy="2983230"/>
                     </a:xfrm>
                     <a:prstGeom prst="rect">
                       <a:avLst/>
@@ -7182,7 +7205,7 @@
         </w:rPr>
         <w:drawing>
           <wp:inline distT="0" distB="0" distL="0" distR="0">
-            <wp:extent cx="2540635" cy="5868035"/>
+            <wp:extent cx="5303520" cy="2983230"/>
             <wp:effectExtent l="0" t="0" r="0" b="0"/>
             <wp:docPr id="6" name="图片 180"/>
             <wp:cNvGraphicFramePr>
@@ -7207,7 +7230,7 @@
                   <pic:spPr bwMode="auto">
                     <a:xfrm>
                       <a:off x="0" y="0"/>
-                      <a:ext cx="2540635" cy="5868035"/>
+                      <a:ext cx="5303520" cy="2983230"/>
                     </a:xfrm>
                     <a:prstGeom prst="rect">
                       <a:avLst/>
@@ -7361,7 +7384,7 @@
         </w:rPr>
         <w:drawing>
           <wp:inline distT="0" distB="0" distL="0" distR="0">
-            <wp:extent cx="3263265" cy="3801110"/>
+            <wp:extent cx="5303520" cy="2983230"/>
             <wp:effectExtent l="0" t="0" r="0" b="0"/>
             <wp:docPr id="7" name="图片 181"/>
             <wp:cNvGraphicFramePr>
@@ -7386,7 +7409,7 @@
                   <pic:spPr bwMode="auto">
                     <a:xfrm>
                       <a:off x="0" y="0"/>
-                      <a:ext cx="3263265" cy="3801110"/>
+                      <a:ext cx="5303520" cy="2983230"/>
                     </a:xfrm>
                     <a:prstGeom prst="rect">
                       <a:avLst/>
@@ -7501,7 +7524,7 @@
         </w:rPr>
         <w:drawing>
           <wp:inline distT="0" distB="0" distL="0" distR="0">
-            <wp:extent cx="2685415" cy="2706370"/>
+            <wp:extent cx="5303520" cy="2983230"/>
             <wp:effectExtent l="0" t="0" r="0" b="0"/>
             <wp:docPr id="8" name="图片 182"/>
             <wp:cNvGraphicFramePr>
@@ -7526,7 +7549,7 @@
                   <pic:spPr bwMode="auto">
                     <a:xfrm>
                       <a:off x="0" y="0"/>
-                      <a:ext cx="2685415" cy="2706370"/>
+                      <a:ext cx="5303520" cy="2983230"/>
                     </a:xfrm>
                     <a:prstGeom prst="rect">
                       <a:avLst/>
@@ -7616,7 +7639,7 @@
         </w:rPr>
         <w:drawing>
           <wp:inline distT="0" distB="0" distL="0" distR="0">
-            <wp:extent cx="2195195" cy="3394075"/>
+            <wp:extent cx="5303520" cy="2983230"/>
             <wp:effectExtent l="0" t="0" r="0" b="0"/>
             <wp:docPr id="9" name="图片 194"/>
             <wp:cNvGraphicFramePr>
@@ -7641,7 +7664,7 @@
                   <pic:spPr bwMode="auto">
                     <a:xfrm>
                       <a:off x="0" y="0"/>
-                      <a:ext cx="2195195" cy="3394075"/>
+                      <a:ext cx="5303520" cy="2983230"/>
                     </a:xfrm>
                     <a:prstGeom prst="rect">
                       <a:avLst/>
@@ -7729,7 +7752,7 @@
         </w:rPr>
         <w:drawing>
           <wp:inline distT="0" distB="0" distL="0" distR="0">
-            <wp:extent cx="2690495" cy="2574925"/>
+            <wp:extent cx="5303520" cy="2983230"/>
             <wp:effectExtent l="0" t="0" r="0" b="0"/>
             <wp:docPr id="10" name="图片 185"/>
             <wp:cNvGraphicFramePr>
@@ -7754,7 +7777,7 @@
                   <pic:spPr bwMode="auto">
                     <a:xfrm>
                       <a:off x="0" y="0"/>
-                      <a:ext cx="2690495" cy="2574925"/>
+                      <a:ext cx="5303520" cy="2983230"/>
                     </a:xfrm>
                     <a:prstGeom prst="rect">
                       <a:avLst/>
@@ -7853,7 +7876,7 @@
         </w:rPr>
         <w:drawing>
           <wp:inline distT="0" distB="0" distL="0" distR="0">
-            <wp:extent cx="2178050" cy="3340100"/>
+            <wp:extent cx="5303520" cy="2983230"/>
             <wp:effectExtent l="0" t="0" r="0" b="0"/>
             <wp:docPr id="11" name="图片 186"/>
             <wp:cNvGraphicFramePr>
@@ -7878,7 +7901,7 @@
                   <pic:spPr bwMode="auto">
                     <a:xfrm>
                       <a:off x="0" y="0"/>
-                      <a:ext cx="2178050" cy="3340100"/>
+                      <a:ext cx="5303520" cy="2983230"/>
                     </a:xfrm>
                     <a:prstGeom prst="rect">
                       <a:avLst/>
@@ -8178,7 +8201,7 @@
         </w:rPr>
         <w:drawing>
           <wp:inline distT="0" distB="0" distL="0" distR="0">
-            <wp:extent cx="3966845" cy="1844040"/>
+            <wp:extent cx="5303520" cy="2983230"/>
             <wp:effectExtent l="0" t="0" r="0" b="0"/>
             <wp:docPr id="12" name="图片 151"/>
             <wp:cNvGraphicFramePr>
@@ -8203,7 +8226,7 @@
                   <pic:spPr bwMode="auto">
                     <a:xfrm>
                       <a:off x="0" y="0"/>
-                      <a:ext cx="3966845" cy="1844040"/>
+                      <a:ext cx="5303520" cy="2983230"/>
                     </a:xfrm>
                     <a:prstGeom prst="rect">
                       <a:avLst/>
@@ -8322,7 +8345,7 @@
         </w:rPr>
         <w:drawing>
           <wp:inline distT="0" distB="0" distL="0" distR="0">
-            <wp:extent cx="2665730" cy="2954655"/>
+            <wp:extent cx="5303520" cy="2983230"/>
             <wp:effectExtent l="0" t="0" r="0" b="0"/>
             <wp:docPr id="13" name="图片 195"/>
             <wp:cNvGraphicFramePr>
@@ -8347,7 +8370,7 @@
                   <pic:spPr bwMode="auto">
                     <a:xfrm>
                       <a:off x="0" y="0"/>
-                      <a:ext cx="2665730" cy="2954655"/>
+                      <a:ext cx="5303520" cy="2983230"/>
                     </a:xfrm>
                     <a:prstGeom prst="rect">
                       <a:avLst/>
@@ -14876,7 +14899,7 @@
         </w:rPr>
         <w:drawing>
           <wp:inline distT="0" distB="0" distL="0" distR="0">
-            <wp:extent cx="5467985" cy="2599055"/>
+            <wp:extent cx="5303520" cy="2983230"/>
             <wp:effectExtent l="0" t="0" r="0" b="0"/>
             <wp:docPr id="14" name="图片 199"/>
             <wp:cNvGraphicFramePr>
@@ -14901,7 +14924,7 @@
                   <pic:spPr bwMode="auto">
                     <a:xfrm>
                       <a:off x="0" y="0"/>
-                      <a:ext cx="5467985" cy="2599055"/>
+                      <a:ext cx="5303520" cy="2983230"/>
                     </a:xfrm>
                     <a:prstGeom prst="rect">
                       <a:avLst/>
@@ -42137,7 +42160,7 @@
         </w:rPr>
         <w:drawing>
           <wp:inline distT="0" distB="0" distL="0" distR="0">
-            <wp:extent cx="3205480" cy="1235710"/>
+            <wp:extent cx="5303520" cy="2983230"/>
             <wp:effectExtent l="0" t="0" r="0" b="0"/>
             <wp:docPr id="15" name="图片 158"/>
             <wp:cNvGraphicFramePr>
@@ -42162,7 +42185,7 @@
                   <pic:spPr bwMode="auto">
                     <a:xfrm>
                       <a:off x="0" y="0"/>
-                      <a:ext cx="3205480" cy="1235710"/>
+                      <a:ext cx="5303520" cy="2983230"/>
                     </a:xfrm>
                     <a:prstGeom prst="rect">
                       <a:avLst/>
@@ -43876,7 +43899,7 @@
         </w:rPr>
         <w:drawing>
           <wp:inline distT="0" distB="0" distL="0" distR="0">
-            <wp:extent cx="4617085" cy="2456815"/>
+            <wp:extent cx="5303520" cy="2983230"/>
             <wp:effectExtent l="0" t="0" r="0" b="0"/>
             <wp:docPr id="16" name="图片 120"/>
             <wp:cNvGraphicFramePr>
@@ -43901,7 +43924,7 @@
                   <pic:spPr bwMode="auto">
                     <a:xfrm>
                       <a:off x="0" y="0"/>
-                      <a:ext cx="4617085" cy="2456815"/>
+                      <a:ext cx="5303520" cy="2983230"/>
                     </a:xfrm>
                     <a:prstGeom prst="rect">
                       <a:avLst/>
@@ -44026,7 +44049,7 @@
         </w:rPr>
         <w:drawing>
           <wp:inline distT="0" distB="0" distL="0" distR="0">
-            <wp:extent cx="4394200" cy="1832610"/>
+            <wp:extent cx="5303520" cy="2983230"/>
             <wp:effectExtent l="0" t="0" r="0" b="0"/>
             <wp:docPr id="17" name="图片 160"/>
             <wp:cNvGraphicFramePr>
@@ -44051,7 +44074,7 @@
                   <pic:spPr bwMode="auto">
                     <a:xfrm>
                       <a:off x="0" y="0"/>
-                      <a:ext cx="4394200" cy="1832610"/>
+                      <a:ext cx="5303520" cy="2983230"/>
                     </a:xfrm>
                     <a:prstGeom prst="rect">
                       <a:avLst/>
@@ -44554,7 +44577,7 @@
         </w:rPr>
         <w:drawing>
           <wp:inline distT="0" distB="0" distL="0" distR="0">
-            <wp:extent cx="3940175" cy="1576705"/>
+            <wp:extent cx="5303520" cy="2983230"/>
             <wp:effectExtent l="0" t="0" r="0" b="0"/>
             <wp:docPr id="18" name="图片 161"/>
             <wp:cNvGraphicFramePr>
@@ -44579,7 +44602,7 @@
                   <pic:spPr bwMode="auto">
                     <a:xfrm>
                       <a:off x="0" y="0"/>
-                      <a:ext cx="3940175" cy="1576705"/>
+                      <a:ext cx="5303520" cy="2983230"/>
                     </a:xfrm>
                     <a:prstGeom prst="rect">
                       <a:avLst/>
@@ -44682,7 +44705,7 @@
         </w:rPr>
         <w:drawing>
           <wp:inline distT="0" distB="0" distL="0" distR="0">
-            <wp:extent cx="4305935" cy="2882265"/>
+            <wp:extent cx="5303520" cy="2983230"/>
             <wp:effectExtent l="0" t="0" r="0" b="0"/>
             <wp:docPr id="19" name="图片 162"/>
             <wp:cNvGraphicFramePr>
@@ -44707,7 +44730,7 @@
                   <pic:spPr bwMode="auto">
                     <a:xfrm>
                       <a:off x="0" y="0"/>
-                      <a:ext cx="4305935" cy="2882265"/>
+                      <a:ext cx="5303520" cy="2983230"/>
                     </a:xfrm>
                     <a:prstGeom prst="rect">
                       <a:avLst/>
@@ -45527,7 +45550,7 @@
         </w:rPr>
         <w:drawing>
           <wp:inline distT="0" distB="0" distL="0" distR="0">
-            <wp:extent cx="5220335" cy="1983740"/>
+            <wp:extent cx="5303520" cy="2983230"/>
             <wp:effectExtent l="0" t="0" r="0" b="0"/>
             <wp:docPr id="20" name="图片 178"/>
             <wp:cNvGraphicFramePr>
@@ -45552,7 +45575,7 @@
                   <pic:spPr bwMode="auto">
                     <a:xfrm>
                       <a:off x="0" y="0"/>
-                      <a:ext cx="5220335" cy="1983740"/>
+                      <a:ext cx="5303520" cy="2983230"/>
                     </a:xfrm>
                     <a:prstGeom prst="rect">
                       <a:avLst/>
@@ -46662,7 +46685,7 @@
         </w:rPr>
         <w:drawing>
           <wp:inline distT="0" distB="0" distL="0" distR="0">
-            <wp:extent cx="3011170" cy="2814320"/>
+            <wp:extent cx="5303520" cy="2983230"/>
             <wp:effectExtent l="0" t="0" r="0" b="0"/>
             <wp:docPr id="21" name="图片 179"/>
             <wp:cNvGraphicFramePr>
@@ -46687,7 +46710,7 @@
                   <pic:spPr bwMode="auto">
                     <a:xfrm>
                       <a:off x="0" y="0"/>
-                      <a:ext cx="3011170" cy="2814320"/>
+                      <a:ext cx="5303520" cy="2983230"/>
                     </a:xfrm>
                     <a:prstGeom prst="rect">
                       <a:avLst/>
@@ -47322,7 +47345,7 @@
         <w:rPr/>
         <w:drawing>
           <wp:inline distT="0" distB="0" distL="0" distR="0">
-            <wp:extent cx="4732020" cy="2752090"/>
+            <wp:extent cx="5303520" cy="2983230"/>
             <wp:effectExtent l="0" t="0" r="0" b="0"/>
             <wp:docPr id="22" name="图片 108"/>
             <wp:cNvGraphicFramePr>
@@ -47347,7 +47370,7 @@
                   <pic:spPr bwMode="auto">
                     <a:xfrm>
                       <a:off x="0" y="0"/>
-                      <a:ext cx="4732020" cy="2752090"/>
+                      <a:ext cx="5303520" cy="2983230"/>
                     </a:xfrm>
                     <a:prstGeom prst="rect">
                       <a:avLst/>
@@ -47902,7 +47925,7 @@
         </w:rPr>
         <w:drawing>
           <wp:inline distT="0" distB="0" distL="0" distR="0">
-            <wp:extent cx="4054475" cy="3246120"/>
+            <wp:extent cx="5303520" cy="2983230"/>
             <wp:effectExtent l="0" t="0" r="0" b="0"/>
             <wp:docPr id="23" name="图片 165"/>
             <wp:cNvGraphicFramePr>
@@ -47927,7 +47950,7 @@
                   <pic:spPr bwMode="auto">
                     <a:xfrm>
                       <a:off x="0" y="0"/>
-                      <a:ext cx="4054475" cy="3246120"/>
+                      <a:ext cx="5303520" cy="2983230"/>
                     </a:xfrm>
                     <a:prstGeom prst="rect">
                       <a:avLst/>
@@ -48676,7 +48699,7 @@
         </w:rPr>
         <w:drawing>
           <wp:inline distT="0" distB="0" distL="0" distR="0">
-            <wp:extent cx="4707255" cy="2943860"/>
+            <wp:extent cx="5303520" cy="2983230"/>
             <wp:effectExtent l="0" t="0" r="0" b="0"/>
             <wp:docPr id="24" name="图片 196"/>
             <wp:cNvGraphicFramePr>
@@ -48701,7 +48724,7 @@
                   <pic:spPr bwMode="auto">
                     <a:xfrm>
                       <a:off x="0" y="0"/>
-                      <a:ext cx="4707255" cy="2943860"/>
+                      <a:ext cx="5303520" cy="2983230"/>
                     </a:xfrm>
                     <a:prstGeom prst="rect">
                       <a:avLst/>
@@ -49394,7 +49417,7 @@
         </w:rPr>
         <w:drawing>
           <wp:inline distT="0" distB="0" distL="0" distR="0">
-            <wp:extent cx="4852670" cy="3648710"/>
+            <wp:extent cx="5303520" cy="2983230"/>
             <wp:effectExtent l="0" t="0" r="0" b="0"/>
             <wp:docPr id="25" name="图片 167"/>
             <wp:cNvGraphicFramePr>
@@ -49419,7 +49442,7 @@
                   <pic:spPr bwMode="auto">
                     <a:xfrm>
                       <a:off x="0" y="0"/>
-                      <a:ext cx="4852670" cy="3648710"/>
+                      <a:ext cx="5303520" cy="2983230"/>
                     </a:xfrm>
                     <a:prstGeom prst="rect">
                       <a:avLst/>
@@ -49520,7 +49543,7 @@
         </w:rPr>
         <w:drawing>
           <wp:inline distT="0" distB="0" distL="0" distR="0">
-            <wp:extent cx="4602480" cy="1849120"/>
+            <wp:extent cx="5303520" cy="2983230"/>
             <wp:effectExtent l="0" t="0" r="0" b="0"/>
             <wp:docPr id="26" name="图片 168"/>
             <wp:cNvGraphicFramePr>
@@ -49545,7 +49568,7 @@
                   <pic:spPr bwMode="auto">
                     <a:xfrm>
                       <a:off x="0" y="0"/>
-                      <a:ext cx="4602480" cy="1849120"/>
+                      <a:ext cx="5303520" cy="2983230"/>
                     </a:xfrm>
                     <a:prstGeom prst="rect">
                       <a:avLst/>
@@ -49669,7 +49692,7 @@
         </w:rPr>
         <w:drawing>
           <wp:inline distT="0" distB="0" distL="0" distR="0">
-            <wp:extent cx="4048760" cy="1983105"/>
+            <wp:extent cx="5303520" cy="2983230"/>
             <wp:effectExtent l="0" t="0" r="0" b="0"/>
             <wp:docPr id="27" name="图片 169"/>
             <wp:cNvGraphicFramePr>
@@ -49694,7 +49717,7 @@
                   <pic:spPr bwMode="auto">
                     <a:xfrm>
                       <a:off x="0" y="0"/>
-                      <a:ext cx="4048760" cy="1983105"/>
+                      <a:ext cx="5303520" cy="2983230"/>
                     </a:xfrm>
                     <a:prstGeom prst="rect">
                       <a:avLst/>
@@ -49817,7 +49840,7 @@
         </w:rPr>
         <w:drawing>
           <wp:inline distT="0" distB="0" distL="0" distR="0">
-            <wp:extent cx="3917315" cy="2580640"/>
+            <wp:extent cx="5303520" cy="2983230"/>
             <wp:effectExtent l="0" t="0" r="0" b="0"/>
             <wp:docPr id="28" name="图片 172"/>
             <wp:cNvGraphicFramePr>
@@ -49842,7 +49865,7 @@
                   <pic:spPr bwMode="auto">
                     <a:xfrm>
                       <a:off x="0" y="0"/>
-                      <a:ext cx="3917315" cy="2580640"/>
+                      <a:ext cx="5303520" cy="2983230"/>
                     </a:xfrm>
                     <a:prstGeom prst="rect">
                       <a:avLst/>
@@ -49954,7 +49977,7 @@
         </w:rPr>
         <w:drawing>
           <wp:inline distT="0" distB="0" distL="0" distR="0">
-            <wp:extent cx="3733165" cy="2384425"/>
+            <wp:extent cx="5303520" cy="2983230"/>
             <wp:effectExtent l="0" t="0" r="0" b="0"/>
             <wp:docPr id="29" name="图片 170"/>
             <wp:cNvGraphicFramePr>
@@ -49979,7 +50002,7 @@
                   <pic:spPr bwMode="auto">
                     <a:xfrm>
                       <a:off x="0" y="0"/>
-                      <a:ext cx="3733165" cy="2384425"/>
+                      <a:ext cx="5303520" cy="2983230"/>
                     </a:xfrm>
                     <a:prstGeom prst="rect">
                       <a:avLst/>
@@ -50123,7 +50146,7 @@
         </w:rPr>
         <w:drawing>
           <wp:inline distT="0" distB="0" distL="0" distR="0">
-            <wp:extent cx="3928745" cy="2393315"/>
+            <wp:extent cx="5303520" cy="2983230"/>
             <wp:effectExtent l="0" t="0" r="0" b="0"/>
             <wp:docPr id="30" name="图片 188"/>
             <wp:cNvGraphicFramePr>
@@ -50148,7 +50171,7 @@
                   <pic:spPr bwMode="auto">
                     <a:xfrm>
                       <a:off x="0" y="0"/>
-                      <a:ext cx="3928745" cy="2393315"/>
+                      <a:ext cx="5303520" cy="2983230"/>
                     </a:xfrm>
                     <a:prstGeom prst="rect">
                       <a:avLst/>
@@ -50829,7 +50852,7 @@
         </w:rPr>
         <w:drawing>
           <wp:inline distT="0" distB="0" distL="0" distR="0">
-            <wp:extent cx="4262755" cy="2299335"/>
+            <wp:extent cx="5303520" cy="2983230"/>
             <wp:effectExtent l="0" t="0" r="0" b="0"/>
             <wp:docPr id="31" name="图片 189"/>
             <wp:cNvGraphicFramePr>
@@ -50854,7 +50877,7 @@
                   <pic:spPr bwMode="auto">
                     <a:xfrm>
                       <a:off x="0" y="0"/>
-                      <a:ext cx="4262755" cy="2299335"/>
+                      <a:ext cx="5303520" cy="2983230"/>
                     </a:xfrm>
                     <a:prstGeom prst="rect">
                       <a:avLst/>

</xml_diff>